<commit_message>
Update README image list and project guide
Adjust README to remove the abbreviated/shorthand example and renumber the sample images (4→5). Update image filenames and table entries to reflect the change (low_quality_photo as 4, table_format as 5). Also update the binary MediLight_Project_Guide.docx alongside the README change.
</commit_message>
<xml_diff>
--- a/MediLight_Project_Guide.docx
+++ b/MediLight_Project_Guide.docx
@@ -183,7 +183,23 @@
           <w:sz w:val="23"/>
           <w:szCs w:val="23"/>
         </w:rPr>
-        <w:t>The system matches medications against a live database of what’s actually in stock</w:t>
+        <w:t xml:space="preserve">The system matches medications against a live database of what’s </w:t>
+      </w:r>
+      <w:proofErr w:type="gramStart"/>
+      <w:r>
+        <w:rPr>
+          <w:sz w:val="23"/>
+          <w:szCs w:val="23"/>
+        </w:rPr>
+        <w:t>actually in</w:t>
+      </w:r>
+      <w:proofErr w:type="gramEnd"/>
+      <w:r>
+        <w:rPr>
+          <w:sz w:val="23"/>
+          <w:szCs w:val="23"/>
+        </w:rPr>
+        <w:t xml:space="preserve"> stock</w:t>
       </w:r>
     </w:p>
     <w:p>
@@ -300,12 +316,6 @@
         <w:gridCol w:w="3560"/>
       </w:tblGrid>
       <w:tr>
-        <w:tblPrEx>
-          <w:tblCellMar>
-            <w:top w:w="0" w:type="dxa"/>
-            <w:bottom w:w="0" w:type="dxa"/>
-          </w:tblCellMar>
-        </w:tblPrEx>
         <w:tc>
           <w:tcPr>
             <w:tcW w:w="2800" w:type="dxa"/>
@@ -401,12 +411,6 @@
         </w:tc>
       </w:tr>
       <w:tr>
-        <w:tblPrEx>
-          <w:tblCellMar>
-            <w:top w:w="0" w:type="dxa"/>
-            <w:bottom w:w="0" w:type="dxa"/>
-          </w:tblCellMar>
-        </w:tblPrEx>
         <w:tc>
           <w:tcPr>
             <w:tcW w:w="2800" w:type="dxa"/>
@@ -490,12 +494,6 @@
         </w:tc>
       </w:tr>
       <w:tr>
-        <w:tblPrEx>
-          <w:tblCellMar>
-            <w:top w:w="0" w:type="dxa"/>
-            <w:bottom w:w="0" w:type="dxa"/>
-          </w:tblCellMar>
-        </w:tblPrEx>
         <w:tc>
           <w:tcPr>
             <w:tcW w:w="2800" w:type="dxa"/>
@@ -579,12 +577,6 @@
         </w:tc>
       </w:tr>
       <w:tr>
-        <w:tblPrEx>
-          <w:tblCellMar>
-            <w:top w:w="0" w:type="dxa"/>
-            <w:bottom w:w="0" w:type="dxa"/>
-          </w:tblCellMar>
-        </w:tblPrEx>
         <w:tc>
           <w:tcPr>
             <w:tcW w:w="2800" w:type="dxa"/>
@@ -669,12 +661,6 @@
         </w:tc>
       </w:tr>
       <w:tr>
-        <w:tblPrEx>
-          <w:tblCellMar>
-            <w:top w:w="0" w:type="dxa"/>
-            <w:bottom w:w="0" w:type="dxa"/>
-          </w:tblCellMar>
-        </w:tblPrEx>
         <w:tc>
           <w:tcPr>
             <w:tcW w:w="2800" w:type="dxa"/>
@@ -758,12 +744,6 @@
         </w:tc>
       </w:tr>
       <w:tr>
-        <w:tblPrEx>
-          <w:tblCellMar>
-            <w:top w:w="0" w:type="dxa"/>
-            <w:bottom w:w="0" w:type="dxa"/>
-          </w:tblCellMar>
-        </w:tblPrEx>
         <w:tc>
           <w:tcPr>
             <w:tcW w:w="2800" w:type="dxa"/>
@@ -847,12 +827,6 @@
         </w:tc>
       </w:tr>
       <w:tr>
-        <w:tblPrEx>
-          <w:tblCellMar>
-            <w:top w:w="0" w:type="dxa"/>
-            <w:bottom w:w="0" w:type="dxa"/>
-          </w:tblCellMar>
-        </w:tblPrEx>
         <w:tc>
           <w:tcPr>
             <w:tcW w:w="2800" w:type="dxa"/>
@@ -936,12 +910,6 @@
         </w:tc>
       </w:tr>
       <w:tr>
-        <w:tblPrEx>
-          <w:tblCellMar>
-            <w:top w:w="0" w:type="dxa"/>
-            <w:bottom w:w="0" w:type="dxa"/>
-          </w:tblCellMar>
-        </w:tblPrEx>
         <w:tc>
           <w:tcPr>
             <w:tcW w:w="2800" w:type="dxa"/>
@@ -1025,12 +993,6 @@
         </w:tc>
       </w:tr>
       <w:tr>
-        <w:tblPrEx>
-          <w:tblCellMar>
-            <w:top w:w="0" w:type="dxa"/>
-            <w:bottom w:w="0" w:type="dxa"/>
-          </w:tblCellMar>
-        </w:tblPrEx>
         <w:tc>
           <w:tcPr>
             <w:tcW w:w="2800" w:type="dxa"/>
@@ -1128,7 +1090,23 @@
           <w:sz w:val="23"/>
           <w:szCs w:val="23"/>
         </w:rPr>
-        <w:t>Every service used is free-tier. No credit card needed anywhere.</w:t>
+        <w:t xml:space="preserve">Every service used is </w:t>
+      </w:r>
+      <w:proofErr w:type="gramStart"/>
+      <w:r>
+        <w:rPr>
+          <w:sz w:val="23"/>
+          <w:szCs w:val="23"/>
+        </w:rPr>
+        <w:t>free-tier</w:t>
+      </w:r>
+      <w:proofErr w:type="gramEnd"/>
+      <w:r>
+        <w:rPr>
+          <w:sz w:val="23"/>
+          <w:szCs w:val="23"/>
+        </w:rPr>
+        <w:t>. No credit card needed anywhere.</w:t>
       </w:r>
     </w:p>
     <w:p>
@@ -1677,7 +1655,23 @@
           <w:sz w:val="23"/>
           <w:szCs w:val="23"/>
         </w:rPr>
-        <w:t>Six prescription images are included in this repository’s prescriptions/ folder. Each tests different real-world challenges:</w:t>
+        <w:t xml:space="preserve">Six prescription images are included in this repository’s prescriptions/ folder. Each </w:t>
+      </w:r>
+      <w:proofErr w:type="gramStart"/>
+      <w:r>
+        <w:rPr>
+          <w:sz w:val="23"/>
+          <w:szCs w:val="23"/>
+        </w:rPr>
+        <w:t>tests</w:t>
+      </w:r>
+      <w:proofErr w:type="gramEnd"/>
+      <w:r>
+        <w:rPr>
+          <w:sz w:val="23"/>
+          <w:szCs w:val="23"/>
+        </w:rPr>
+        <w:t xml:space="preserve"> different real-world challenges:</w:t>
       </w:r>
     </w:p>
     <w:p>
@@ -1709,12 +1703,6 @@
         <w:gridCol w:w="3107"/>
       </w:tblGrid>
       <w:tr>
-        <w:tblPrEx>
-          <w:tblCellMar>
-            <w:top w:w="0" w:type="dxa"/>
-            <w:bottom w:w="0" w:type="dxa"/>
-          </w:tblCellMar>
-        </w:tblPrEx>
         <w:tc>
           <w:tcPr>
             <w:tcW w:w="572" w:type="dxa"/>
@@ -1837,12 +1825,6 @@
         </w:tc>
       </w:tr>
       <w:tr>
-        <w:tblPrEx>
-          <w:tblCellMar>
-            <w:top w:w="0" w:type="dxa"/>
-            <w:bottom w:w="0" w:type="dxa"/>
-          </w:tblCellMar>
-        </w:tblPrEx>
         <w:tc>
           <w:tcPr>
             <w:tcW w:w="572" w:type="dxa"/>
@@ -1953,12 +1935,6 @@
         </w:tc>
       </w:tr>
       <w:tr>
-        <w:tblPrEx>
-          <w:tblCellMar>
-            <w:top w:w="0" w:type="dxa"/>
-            <w:bottom w:w="0" w:type="dxa"/>
-          </w:tblCellMar>
-        </w:tblPrEx>
         <w:tc>
           <w:tcPr>
             <w:tcW w:w="572" w:type="dxa"/>
@@ -2069,12 +2045,6 @@
         </w:tc>
       </w:tr>
       <w:tr>
-        <w:tblPrEx>
-          <w:tblCellMar>
-            <w:top w:w="0" w:type="dxa"/>
-            <w:bottom w:w="0" w:type="dxa"/>
-          </w:tblCellMar>
-        </w:tblPrEx>
         <w:tc>
           <w:tcPr>
             <w:tcW w:w="572" w:type="dxa"/>
@@ -2116,19 +2086,32 @@
             <w:vAlign w:val="center"/>
           </w:tcPr>
           <w:p>
-            <w:r>
-              <w:rPr>
-                <w:sz w:val="21"/>
-                <w:szCs w:val="21"/>
-              </w:rPr>
-              <w:t>3</w:t>
-            </w:r>
-            <w:r>
-              <w:rPr>
-                <w:sz w:val="21"/>
-                <w:szCs w:val="21"/>
-              </w:rPr>
-              <w:t>_abbreviated_shorthand.png</w:t>
+            <w:pPr>
+              <w:rPr>
+                <w:sz w:val="21"/>
+                <w:szCs w:val="21"/>
+              </w:rPr>
+            </w:pPr>
+            <w:r>
+              <w:rPr>
+                <w:sz w:val="21"/>
+                <w:szCs w:val="21"/>
+              </w:rPr>
+              <w:t>3_</w:t>
+            </w:r>
+            <w:r>
+              <w:rPr>
+                <w:sz w:val="21"/>
+                <w:szCs w:val="21"/>
+              </w:rPr>
+              <w:t>misspelled_smudged</w:t>
+            </w:r>
+            <w:r>
+              <w:rPr>
+                <w:sz w:val="21"/>
+                <w:szCs w:val="21"/>
+              </w:rPr>
+              <w:t>.png</w:t>
             </w:r>
           </w:p>
         </w:tc>
@@ -2150,12 +2133,18 @@
             <w:vAlign w:val="center"/>
           </w:tcPr>
           <w:p>
-            <w:r>
-              <w:rPr>
-                <w:sz w:val="21"/>
-                <w:szCs w:val="21"/>
-              </w:rPr>
-              <w:t>Medical shorthand (#30)</w:t>
+            <w:pPr>
+              <w:rPr>
+                <w:sz w:val="21"/>
+                <w:szCs w:val="21"/>
+              </w:rPr>
+            </w:pPr>
+            <w:r>
+              <w:rPr>
+                <w:sz w:val="21"/>
+                <w:szCs w:val="21"/>
+              </w:rPr>
+              <w:t>Typos + ink smudge</w:t>
             </w:r>
           </w:p>
         </w:tc>
@@ -2177,23 +2166,23 @@
             <w:vAlign w:val="center"/>
           </w:tcPr>
           <w:p>
-            <w:r>
-              <w:rPr>
-                <w:sz w:val="21"/>
-                <w:szCs w:val="21"/>
-              </w:rPr>
-              <w:t>Lisinopril, Alprazolam, Cetirizine, Prednisone</w:t>
+            <w:pPr>
+              <w:rPr>
+                <w:sz w:val="21"/>
+                <w:szCs w:val="21"/>
+              </w:rPr>
+            </w:pPr>
+            <w:r>
+              <w:rPr>
+                <w:sz w:val="21"/>
+                <w:szCs w:val="21"/>
+              </w:rPr>
+              <w:t>Codeine, Omeprazole, Cetirizine</w:t>
             </w:r>
           </w:p>
         </w:tc>
       </w:tr>
       <w:tr>
-        <w:tblPrEx>
-          <w:tblCellMar>
-            <w:top w:w="0" w:type="dxa"/>
-            <w:bottom w:w="0" w:type="dxa"/>
-          </w:tblCellMar>
-        </w:tblPrEx>
         <w:tc>
           <w:tcPr>
             <w:tcW w:w="572" w:type="dxa"/>
@@ -2240,14 +2229,7 @@
                 <w:sz w:val="21"/>
                 <w:szCs w:val="21"/>
               </w:rPr>
-              <w:t>4</w:t>
-            </w:r>
-            <w:r>
-              <w:rPr>
-                <w:sz w:val="21"/>
-                <w:szCs w:val="21"/>
-              </w:rPr>
-              <w:t>_low_quality_photo.png</w:t>
+              <w:t>4_low_quality_photo.png</w:t>
             </w:r>
           </w:p>
         </w:tc>
@@ -2307,12 +2289,6 @@
         </w:tc>
       </w:tr>
       <w:tr>
-        <w:tblPrEx>
-          <w:tblCellMar>
-            <w:top w:w="0" w:type="dxa"/>
-            <w:bottom w:w="0" w:type="dxa"/>
-          </w:tblCellMar>
-        </w:tblPrEx>
         <w:tc>
           <w:tcPr>
             <w:tcW w:w="572" w:type="dxa"/>
@@ -2359,14 +2335,7 @@
                 <w:sz w:val="21"/>
                 <w:szCs w:val="21"/>
               </w:rPr>
-              <w:t>5</w:t>
-            </w:r>
-            <w:r>
-              <w:rPr>
-                <w:sz w:val="21"/>
-                <w:szCs w:val="21"/>
-              </w:rPr>
-              <w:t>_table_format.png</w:t>
+              <w:t>5_table_format.png</w:t>
             </w:r>
           </w:p>
         </w:tc>
@@ -3991,7 +3960,6 @@
   <w:style w:type="character" w:default="1" w:styleId="DefaultParagraphFont">
     <w:name w:val="Default Paragraph Font"/>
     <w:uiPriority w:val="1"/>
-    <w:semiHidden/>
     <w:unhideWhenUsed/>
   </w:style>
   <w:style w:type="table" w:default="1" w:styleId="TableNormal">

</xml_diff>